<commit_message>
Complete the appellate appendix certification form, replace a deprecated path call, name the security channel
Appendix certification in 10-appellate-brief.docx now carries the full s. 809.19(8g)(b)1. form with the cross-reference s. 809.23(3)(a) or (b) (L-012). cite_check.py uses a local Windows reserved-name check instead of PurePath.is_reserved(), deprecated for removal in Python 3.15 (E-014). README names GitHub private vulnerability reporting as the security channel.
</commit_message>
<xml_diff>
--- a/skills/wisconsin-legal-writing/assets/10-appellate-brief.docx
+++ b/skills/wisconsin-legal-writing/assets/10-appellate-brief.docx
@@ -1380,6 +1380,34 @@
     <w:p>
       <w:pPr>
         <w:spacing w:after="0" w:before="0" w:line="360" w:lineRule="auto"/>
+        <w:jc w:val="center"/>
+      </w:pPr>
+      <w:r>
+        <w:rPr>
+          <w:rFonts w:ascii="Century Schoolbook" w:hAnsi="Century Schoolbook"/>
+          <w:b/>
+          <w:sz w:val="26"/>
+          <w:u w:val="none"/>
+        </w:rPr>
+        <w:t>CERTIFICATION BY ATTORNEY</w:t>
+      </w:r>
+    </w:p>
+    <w:p>
+      <w:pPr>
+        <w:spacing w:after="0" w:before="0"/>
+      </w:pPr>
+      <w:r>
+        <w:rPr>
+          <w:rFonts w:ascii="Century Schoolbook" w:hAnsi="Century Schoolbook"/>
+          <w:b w:val="0"/>
+          <w:sz w:val="24"/>
+          <w:u w:val="none"/>
+        </w:rPr>
+      </w:r>
+    </w:p>
+    <w:p>
+      <w:pPr>
+        <w:spacing w:after="0" w:before="0" w:line="360" w:lineRule="auto"/>
         <w:jc w:val="both"/>
       </w:pPr>
       <w:r>
@@ -1389,7 +1417,119 @@
           <w:sz w:val="26"/>
           <w:u w:val="none"/>
         </w:rPr>
-        <w:t>CERTIFICATION AS TO APPENDIX: I hereby certify that filed with this brief is an appendix that complies with s. 809.19(2)(a) and that contains, at a minimum: (1) a table of contents; (2) the findings or opinion of the circuit court; (3) a copy of any unpublished opinion cited under s. 809.23(3)(a)2. or (b); and (4) portions of the record essential to an understanding of the issues raised, including oral or written rulings or decisions showing the circuit court’s reasoning regarding those issues.</w:t>
+        <w:t>I hereby certify that filed with this brief is an appendix that complies with s. 809.19(2)(a) and that contains, at a minimum: (1) a table of contents; (2) the findings or opinion of the circuit court; (3) a copy of any unpublished opinion cited under s. 809.23(3)(a) or (b); and (4) portions of the record essential to an understanding of the issues raised, including oral or written rulings or decisions showing the circuit court’s reasoning regarding those issues.</w:t>
+      </w:r>
+    </w:p>
+    <w:p>
+      <w:pPr>
+        <w:spacing w:after="0" w:before="0"/>
+      </w:pPr>
+      <w:r>
+        <w:rPr>
+          <w:rFonts w:ascii="Century Schoolbook" w:hAnsi="Century Schoolbook"/>
+          <w:b w:val="0"/>
+          <w:sz w:val="24"/>
+          <w:u w:val="none"/>
+        </w:rPr>
+      </w:r>
+    </w:p>
+    <w:p>
+      <w:pPr>
+        <w:spacing w:after="0" w:before="0" w:line="360" w:lineRule="auto"/>
+        <w:jc w:val="both"/>
+      </w:pPr>
+      <w:r>
+        <w:rPr>
+          <w:rFonts w:ascii="Century Schoolbook" w:hAnsi="Century Schoolbook"/>
+          <w:b w:val="0"/>
+          <w:sz w:val="26"/>
+          <w:u w:val="none"/>
+        </w:rPr>
+        <w:t>I further certify that if this appeal is taken from a circuit court order or judgment entered in a judicial review of an administrative decision, the appendix contains the findings of fact and conclusions of law, if any, and final decision of the administrative agency.</w:t>
+      </w:r>
+    </w:p>
+    <w:p>
+      <w:pPr>
+        <w:spacing w:after="0" w:before="0"/>
+      </w:pPr>
+      <w:r>
+        <w:rPr>
+          <w:rFonts w:ascii="Century Schoolbook" w:hAnsi="Century Schoolbook"/>
+          <w:b w:val="0"/>
+          <w:sz w:val="24"/>
+          <w:u w:val="none"/>
+        </w:rPr>
+      </w:r>
+    </w:p>
+    <w:p>
+      <w:pPr>
+        <w:spacing w:after="0" w:before="0" w:line="360" w:lineRule="auto"/>
+        <w:jc w:val="both"/>
+      </w:pPr>
+      <w:r>
+        <w:rPr>
+          <w:rFonts w:ascii="Century Schoolbook" w:hAnsi="Century Schoolbook"/>
+          <w:b w:val="0"/>
+          <w:sz w:val="26"/>
+          <w:u w:val="none"/>
+        </w:rPr>
+        <w:t>I further certify that if the record is required by law to be confidential, the portions of the record included in the appendix are reproduced using one or more initials or other appropriate pseudonym or designation instead of full names of persons, specifically including juveniles and parents of juveniles, with a notation that the portions of the record have been so reproduced to preserve confidentiality and with appropriate references to the record.</w:t>
+      </w:r>
+    </w:p>
+    <w:p>
+      <w:pPr>
+        <w:spacing w:after="0" w:before="0"/>
+      </w:pPr>
+      <w:r>
+        <w:rPr>
+          <w:rFonts w:ascii="Century Schoolbook" w:hAnsi="Century Schoolbook"/>
+          <w:b w:val="0"/>
+          <w:sz w:val="24"/>
+          <w:u w:val="none"/>
+        </w:rPr>
+      </w:r>
+    </w:p>
+    <w:p>
+      <w:pPr>
+        <w:spacing w:after="0" w:before="0" w:line="360" w:lineRule="auto"/>
+        <w:jc w:val="left"/>
+      </w:pPr>
+      <w:r>
+        <w:rPr>
+          <w:rFonts w:ascii="Century Schoolbook" w:hAnsi="Century Schoolbook"/>
+          <w:b w:val="0"/>
+          <w:sz w:val="26"/>
+          <w:u w:val="none"/>
+        </w:rPr>
+        <w:t>Signed: ____________________</w:t>
+      </w:r>
+    </w:p>
+    <w:p>
+      <w:pPr>
+        <w:spacing w:after="0" w:before="0"/>
+      </w:pPr>
+      <w:r>
+        <w:rPr>
+          <w:rFonts w:ascii="Century Schoolbook" w:hAnsi="Century Schoolbook"/>
+          <w:b w:val="0"/>
+          <w:sz w:val="24"/>
+          <w:u w:val="none"/>
+        </w:rPr>
+      </w:r>
+    </w:p>
+    <w:p>
+      <w:pPr>
+        <w:spacing w:after="0" w:before="0" w:line="360" w:lineRule="auto"/>
+        <w:jc w:val="left"/>
+      </w:pPr>
+      <w:r>
+        <w:rPr>
+          <w:rFonts w:ascii="Century Schoolbook" w:hAnsi="Century Schoolbook"/>
+          <w:b w:val="0"/>
+          <w:sz w:val="26"/>
+          <w:u w:val="none"/>
+        </w:rPr>
+        <w:t>Signature</w:t>
       </w:r>
     </w:p>
     <w:p>

</xml_diff>